<commit_message>
Time administration log entries to end at the report's written_at
The administration hour mirrored from each individual and group
counselling log now runs for the hour before written_at instead of
starting with the session. A migration re-syncs existing entries.

Co-Authored-By: Claude Opus 5.5 <noreply@anthropic.com>
</commit_message>
<xml_diff>
--- a/resources/templates/individual-counselling-log.docx
+++ b/resources/templates/individual-counselling-log.docx
@@ -21,64 +21,6 @@
           <w:lang w:val="en-US"/>
         </w:rPr>
         <w:t>CONFIDENTIAL</w:t>
-      </w:r>
-    </w:p>
-    <w:p>
-      <w:pPr>
-        <w:pStyle w:val="Body A"/>
-        <w:jc w:val="center"/>
-        <w:rPr>
-          <w:sz w:val="24"/>
-          <w:szCs w:val="24"/>
-        </w:rPr>
-      </w:pPr>
-      <w:r>
-        <w:rPr>
-          <w:sz w:val="24"/>
-          <w:szCs w:val="24"/>
-        </w:rPr>
-        <w:drawing xmlns:a="http://schemas.openxmlformats.org/drawingml/2006/main">
-          <wp:inline distT="0" distB="0" distL="0" distR="0">
-            <wp:extent cx="1673420" cy="740315"/>
-            <wp:effectExtent l="0" t="0" r="0" b="0"/>
-            <wp:docPr id="1073741825" name="officeArt object" descr="image1.png"/>
-            <wp:cNvGraphicFramePr/>
-            <a:graphic xmlns:a="http://schemas.openxmlformats.org/drawingml/2006/main">
-              <a:graphicData uri="http://schemas.openxmlformats.org/drawingml/2006/picture">
-                <pic:pic xmlns:pic="http://schemas.openxmlformats.org/drawingml/2006/picture">
-                  <pic:nvPicPr>
-                    <pic:cNvPr id="1073741825" name="image1.png" descr="image1.png"/>
-                    <pic:cNvPicPr>
-                      <a:picLocks noChangeAspect="1"/>
-                    </pic:cNvPicPr>
-                  </pic:nvPicPr>
-                  <pic:blipFill>
-                    <a:blip r:embed="rId4">
-                      <a:extLst/>
-                    </a:blip>
-                    <a:stretch>
-                      <a:fillRect/>
-                    </a:stretch>
-                  </pic:blipFill>
-                  <pic:spPr>
-                    <a:xfrm>
-                      <a:off x="0" y="0"/>
-                      <a:ext cx="1673420" cy="740315"/>
-                    </a:xfrm>
-                    <a:prstGeom prst="rect">
-                      <a:avLst/>
-                    </a:prstGeom>
-                    <a:ln w="12700" cap="flat">
-                      <a:noFill/>
-                      <a:miter lim="400000"/>
-                    </a:ln>
-                    <a:effectLst/>
-                  </pic:spPr>
-                </pic:pic>
-              </a:graphicData>
-            </a:graphic>
-          </wp:inline>
-        </w:drawing>
       </w:r>
     </w:p>
     <w:p>
@@ -540,19 +482,11 @@
     </w:p>
     <w:p>
       <w:pPr>
-        <w:pStyle w:val="Body"/>
+        <w:pStyle w:val="Body B"/>
         <w:spacing w:after="200" w:line="276" w:lineRule="auto"/>
-        <w:rPr>
-          <w:rFonts w:ascii="Times New Roman" w:cs="Times New Roman" w:hAnsi="Times New Roman" w:eastAsia="Times New Roman"/>
-          <w:sz w:val="24"/>
-          <w:szCs w:val="24"/>
-        </w:rPr>
-      </w:pPr>
-      <w:r>
-        <w:rPr>
-          <w:rFonts w:ascii="Times New Roman" w:hAnsi="Times New Roman"/>
-          <w:sz w:val="24"/>
-          <w:szCs w:val="24"/>
+      </w:pPr>
+      <w:r>
+        <w:rPr>
           <w:rtl w:val="0"/>
           <w:lang w:val="en-US"/>
         </w:rPr>
@@ -618,8 +552,8 @@
       </w:r>
     </w:p>
     <w:sectPr>
-      <w:headerReference w:type="default" r:id="rId5"/>
-      <w:footerReference w:type="default" r:id="rId6"/>
+      <w:headerReference w:type="default" r:id="rId4"/>
+      <w:footerReference w:type="default" r:id="rId5"/>
       <w:pgSz w:w="12240" w:h="15840" w:orient="portrait"/>
       <w:pgMar w:top="568" w:right="1440" w:bottom="1440" w:left="1440" w:header="720" w:footer="720"/>
       <w:pgNumType w:start="1"/>
@@ -857,9 +791,9 @@
       </w14:textFill>
     </w:rPr>
   </w:style>
-  <w:style w:type="paragraph" w:styleId="Body">
-    <w:name w:val="Body"/>
-    <w:next w:val="Body"/>
+  <w:style w:type="paragraph" w:styleId="Body B">
+    <w:name w:val="Body B"/>
+    <w:next w:val="Body B"/>
     <w:pPr>
       <w:keepNext w:val="0"/>
       <w:keepLines w:val="0"/>
@@ -894,8 +828,9 @@
       <w:shd w:val="nil" w:color="auto" w:fill="auto"/>
       <w:vertAlign w:val="baseline"/>
       <w:lang w:val="en-US"/>
-      <w14:textOutline>
+      <w14:textOutline w14:w="12700" w14:cap="flat">
         <w14:noFill/>
+        <w14:miter w14:lim="400000"/>
       </w14:textOutline>
       <w14:textFill>
         <w14:solidFill>

</xml_diff>